<commit_message>
cv-patch: skills as labelled lines with inline links
Skills were three fixed slots with labels baked into the template, so a
resume with "Quantitative Methods", "Certifications" etc. got merged and
relabelled, and links inside a skill line (a certification) were dropped.
Skills are now a list of { label, value, links }: extraction keeps the
user's labels as written, the editor manages lines and their links, the
template renders one bold "Label:" line per entry, and link text inside a
value becomes a real hyperlink. Patching may reorder or rephrase values but
not labels or links, and link text must survive the rewrite.
</commit_message>
<xml_diff>
--- a/apps/cv-patch/convex/assets/resume-template.docx
+++ b/apps/cv-patch/convex/assets/resume-template.docx
@@ -1308,417 +1308,52 @@
         <w:t>SKILLS</w:t>
       </w:r>
     </w:p>
-    <w:p ns2:paraId="0FC1B3FC" ns2:textId="771CD051">
-      <w:pPr>
-        <w:pBdr>
-          <w:top w:val="single" w:sz="4" w:space="1" w:color="auto"/>
-        </w:pBdr>
-        <w:rPr>
-          <w:rFonts w:asciiTheme="minorHAnsi" w:hAnsiTheme="minorHAnsi" w:cstheme="minorHAnsi"/>
-          <w:bCs/>
-          <w:sz w:val="18"/>
-          <w:szCs w:val="18"/>
-        </w:rPr>
-      </w:pPr>
-      <w:r>
-        <w:rPr>
-          <w:rFonts w:asciiTheme="minorHAnsi" w:hAnsiTheme="minorHAnsi" w:cstheme="minorHAnsi"/>
-          <w:b/>
-          <w:sz w:val="18"/>
-          <w:szCs w:val="18"/>
-        </w:rPr>
-        <w:t>Technical Skills</w:t>
-      </w:r>
-      <w:r>
-        <w:rPr>
-          <w:rFonts w:asciiTheme="minorHAnsi" w:hAnsiTheme="minorHAnsi" w:cstheme="minorHAnsi"/>
-          <w:b/>
-          <w:sz w:val="18"/>
-          <w:szCs w:val="18"/>
-        </w:rPr>
-        <w:t xml:space="preserve">: </w:t>
-      </w:r>
-      <w:r>
-        <w:rPr>
-          <w:rFonts w:asciiTheme="minorHAnsi" w:hAnsiTheme="minorHAnsi" w:cstheme="minorHAnsi"/>
-          <w:bCs/>
-          <w:sz w:val="18"/>
-          <w:szCs w:val="18"/>
-        </w:rPr>
-        <w:t xml:space="preserve">{skills.technical}</w:t>
-      </w:r>
-      <w:r>
-        <w:rPr>
-          <w:rFonts w:asciiTheme="minorHAnsi" w:hAnsiTheme="minorHAnsi" w:cstheme="minorHAnsi"/>
-          <w:bCs/>
-          <w:sz w:val="18"/>
-          <w:szCs w:val="18"/>
-        </w:rPr>
-        <w:t xml:space="preserve"/>
-      </w:r>
-      <w:r>
-        <w:rPr>
-          <w:rFonts w:asciiTheme="minorHAnsi" w:hAnsiTheme="minorHAnsi" w:cstheme="minorHAnsi"/>
-          <w:bCs/>
-          <w:sz w:val="18"/>
-          <w:szCs w:val="18"/>
-        </w:rPr>
-        <w:t/>
-      </w:r>
-      <w:r>
-        <w:rPr>
-          <w:rFonts w:asciiTheme="minorHAnsi" w:hAnsiTheme="minorHAnsi" w:cstheme="minorHAnsi"/>
-          <w:bCs/>
-          <w:sz w:val="18"/>
-          <w:szCs w:val="18"/>
-        </w:rPr>
-        <w:t/>
-      </w:r>
-      <w:r>
-        <w:rPr>
-          <w:rFonts w:asciiTheme="minorHAnsi" w:hAnsiTheme="minorHAnsi" w:cstheme="minorHAnsi"/>
-          <w:bCs/>
-          <w:sz w:val="18"/>
-          <w:szCs w:val="18"/>
-        </w:rPr>
-        <w:t xml:space="preserve"/>
-      </w:r>
-      <w:r>
-        <w:rPr>
-          <w:rFonts w:asciiTheme="minorHAnsi" w:hAnsiTheme="minorHAnsi" w:cstheme="minorHAnsi"/>
-          <w:bCs/>
-          <w:sz w:val="18"/>
-          <w:szCs w:val="18"/>
-        </w:rPr>
-        <w:t xml:space="preserve"/>
-      </w:r>
-      <w:r>
-        <w:rPr>
-          <w:rFonts w:asciiTheme="minorHAnsi" w:hAnsiTheme="minorHAnsi" w:cstheme="minorHAnsi"/>
-          <w:bCs/>
-          <w:sz w:val="18"/>
-          <w:szCs w:val="18"/>
-        </w:rPr>
-        <w:t/>
-      </w:r>
-      <w:r>
-        <w:rPr>
-          <w:rFonts w:asciiTheme="minorHAnsi" w:hAnsiTheme="minorHAnsi" w:cstheme="minorHAnsi"/>
-          <w:bCs/>
-          <w:sz w:val="18"/>
-          <w:szCs w:val="18"/>
-        </w:rPr>
-        <w:t/>
-      </w:r>
-      <w:r>
-        <w:rPr>
-          <w:rFonts w:asciiTheme="minorHAnsi" w:hAnsiTheme="minorHAnsi" w:cstheme="minorHAnsi"/>
-          <w:bCs/>
-          <w:sz w:val="18"/>
-          <w:szCs w:val="18"/>
-        </w:rPr>
-        <w:t xml:space="preserve"/>
-      </w:r>
-      <w:proofErr w:type="spellStart"/>
-      <w:r>
-        <w:rPr>
-          <w:rFonts w:asciiTheme="minorHAnsi" w:hAnsiTheme="minorHAnsi" w:cstheme="minorHAnsi"/>
-          <w:bCs/>
-          <w:sz w:val="18"/>
-          <w:szCs w:val="18"/>
-        </w:rPr>
-        <w:t/>
-      </w:r>
-      <w:proofErr w:type="spellEnd"/>
-      <w:r>
-        <w:rPr>
-          <w:rFonts w:asciiTheme="minorHAnsi" w:hAnsiTheme="minorHAnsi" w:cstheme="minorHAnsi"/>
-          <w:bCs/>
-          <w:sz w:val="18"/>
-          <w:szCs w:val="18"/>
-        </w:rPr>
-        <w:t xml:space="preserve"/>
-      </w:r>
-      <w:proofErr w:type="spellStart"/>
-      <w:r>
-        <w:rPr>
-          <w:rFonts w:asciiTheme="minorHAnsi" w:hAnsiTheme="minorHAnsi" w:cstheme="minorHAnsi"/>
-          <w:bCs/>
-          <w:sz w:val="18"/>
-          <w:szCs w:val="18"/>
-        </w:rPr>
-        <w:t/>
-      </w:r>
-      <w:proofErr w:type="spellEnd"/>
-      <w:r>
-        <w:rPr>
-          <w:rFonts w:asciiTheme="minorHAnsi" w:hAnsiTheme="minorHAnsi" w:cstheme="minorHAnsi"/>
-          <w:bCs/>
-          <w:sz w:val="18"/>
-          <w:szCs w:val="18"/>
-        </w:rPr>
-        <w:t xml:space="preserve"/>
-      </w:r>
-      <w:r>
-        <w:rPr>
-          <w:rFonts w:asciiTheme="minorHAnsi" w:hAnsiTheme="minorHAnsi" w:cstheme="minorHAnsi"/>
-          <w:bCs/>
-          <w:sz w:val="18"/>
-          <w:szCs w:val="18"/>
-        </w:rPr>
-        <w:t/>
-      </w:r>
-      <w:r>
-        <w:rPr>
-          <w:rFonts w:asciiTheme="minorHAnsi" w:hAnsiTheme="minorHAnsi" w:cstheme="minorHAnsi"/>
-          <w:bCs/>
-          <w:sz w:val="18"/>
-          <w:szCs w:val="18"/>
-        </w:rPr>
-        <w:t/>
+    <w:p>
+      <w:r>
+        <w:t>{#skills}</w:t>
       </w:r>
     </w:p>
-    <w:p ns2:paraId="2BCB3F93" ns2:textId="0ECF478F">
-      <w:pPr>
-        <w:pBdr>
-          <w:top w:val="single" w:sz="4" w:space="1" w:color="auto"/>
-        </w:pBdr>
-        <w:rPr>
-          <w:rFonts w:asciiTheme="minorHAnsi" w:hAnsiTheme="minorHAnsi" w:cstheme="minorHAnsi"/>
-          <w:bCs/>
-          <w:sz w:val="18"/>
-          <w:szCs w:val="18"/>
-        </w:rPr>
-      </w:pPr>
-      <w:r>
-        <w:rPr>
-          <w:rFonts w:asciiTheme="minorHAnsi" w:hAnsiTheme="minorHAnsi" w:cstheme="minorHAnsi"/>
-          <w:b/>
-          <w:sz w:val="18"/>
-          <w:szCs w:val="18"/>
-        </w:rPr>
-        <w:t>Financial Skills</w:t>
-      </w:r>
-      <w:r>
-        <w:rPr>
-          <w:rFonts w:asciiTheme="minorHAnsi" w:hAnsiTheme="minorHAnsi" w:cstheme="minorHAnsi"/>
-          <w:bCs/>
-          <w:sz w:val="18"/>
-          <w:szCs w:val="18"/>
-        </w:rPr>
-        <w:t xml:space="preserve">: </w:t>
-      </w:r>
-      <w:proofErr w:type="spellStart"/>
-      <w:r>
-        <w:rPr>
-          <w:rFonts w:asciiTheme="minorHAnsi" w:hAnsiTheme="minorHAnsi" w:cstheme="minorHAnsi"/>
-          <w:bCs/>
-          <w:sz w:val="18"/>
-          <w:szCs w:val="18"/>
-        </w:rPr>
-        <w:t>{skills.financial}</w:t>
-      </w:r>
-      <w:proofErr w:type="spellEnd"/>
-      <w:r>
-        <w:rPr>
-          <w:rFonts w:asciiTheme="minorHAnsi" w:hAnsiTheme="minorHAnsi" w:cstheme="minorHAnsi"/>
-          <w:bCs/>
-          <w:sz w:val="18"/>
-          <w:szCs w:val="18"/>
-        </w:rPr>
-        <w:t xml:space="preserve"/>
-      </w:r>
-      <w:r>
-        <w:rPr>
-          <w:rFonts w:asciiTheme="minorHAnsi" w:hAnsiTheme="minorHAnsi" w:cstheme="minorHAnsi"/>
-          <w:bCs/>
-          <w:sz w:val="18"/>
-          <w:szCs w:val="18"/>
-        </w:rPr>
-        <w:t/>
-      </w:r>
-      <w:r>
-        <w:rPr>
-          <w:rFonts w:asciiTheme="minorHAnsi" w:hAnsiTheme="minorHAnsi" w:cstheme="minorHAnsi"/>
-          <w:bCs/>
-          <w:sz w:val="18"/>
-          <w:szCs w:val="18"/>
-        </w:rPr>
-        <w:t xml:space="preserve"/>
-      </w:r>
-      <w:r>
-        <w:rPr>
-          <w:rFonts w:asciiTheme="minorHAnsi" w:hAnsiTheme="minorHAnsi" w:cstheme="minorHAnsi"/>
-          <w:bCs/>
-          <w:sz w:val="18"/>
-          <w:szCs w:val="18"/>
-        </w:rPr>
-        <w:t/>
-      </w:r>
-      <w:r>
-        <w:rPr>
-          <w:rFonts w:asciiTheme="minorHAnsi" w:hAnsiTheme="minorHAnsi" w:cstheme="minorHAnsi"/>
-          <w:bCs/>
-          <w:sz w:val="18"/>
-          <w:szCs w:val="18"/>
-        </w:rPr>
-        <w:t xml:space="preserve"/>
-      </w:r>
-      <w:r>
-        <w:rPr>
-          <w:rFonts w:asciiTheme="minorHAnsi" w:hAnsiTheme="minorHAnsi" w:cstheme="minorHAnsi"/>
-          <w:bCs/>
-          <w:sz w:val="18"/>
-          <w:szCs w:val="18"/>
-        </w:rPr>
-        <w:t/>
-      </w:r>
-      <w:r>
-        <w:rPr>
-          <w:rFonts w:asciiTheme="minorHAnsi" w:hAnsiTheme="minorHAnsi" w:cstheme="minorHAnsi"/>
-          <w:bCs/>
-          <w:sz w:val="18"/>
-          <w:szCs w:val="18"/>
-        </w:rPr>
-        <w:t/>
-      </w:r>
-      <w:r>
-        <w:rPr>
-          <w:rFonts w:asciiTheme="minorHAnsi" w:hAnsiTheme="minorHAnsi" w:cstheme="minorHAnsi"/>
-          <w:bCs/>
-          <w:sz w:val="18"/>
-          <w:szCs w:val="18"/>
-        </w:rPr>
-        <w:t/>
-      </w:r>
-      <w:r>
-        <w:rPr>
-          <w:rFonts w:asciiTheme="minorHAnsi" w:hAnsiTheme="minorHAnsi" w:cstheme="minorHAnsi"/>
-          <w:bCs/>
-          <w:sz w:val="18"/>
-          <w:szCs w:val="18"/>
-        </w:rPr>
-        <w:t xml:space="preserve"/>
-      </w:r>
-      <w:r>
-        <w:rPr>
-          <w:rFonts w:asciiTheme="minorHAnsi" w:hAnsiTheme="minorHAnsi" w:cstheme="minorHAnsi"/>
-          <w:bCs/>
-          <w:sz w:val="18"/>
-          <w:szCs w:val="18"/>
-        </w:rPr>
-        <w:t xml:space="preserve"/>
-      </w:r>
-      <w:r>
-        <w:rPr>
-          <w:rFonts w:asciiTheme="minorHAnsi" w:hAnsiTheme="minorHAnsi" w:cstheme="minorHAnsi"/>
-          <w:bCs/>
-          <w:sz w:val="18"/>
-          <w:szCs w:val="18"/>
-        </w:rPr>
-        <w:t xml:space="preserve"/>
-      </w:r>
-      <w:r>
-        <w:rPr>
-          <w:rFonts w:asciiTheme="minorHAnsi" w:hAnsiTheme="minorHAnsi" w:cstheme="minorHAnsi"/>
-          <w:bCs/>
-          <w:sz w:val="18"/>
-          <w:szCs w:val="18"/>
-        </w:rPr>
-        <w:t/>
+    <w:p>
+      <w:pPr>
+        <w:jc w:val="both"/>
+        <w:rPr>
+          <w:rFonts w:asciiTheme="minorHAnsi" w:hAnsiTheme="minorHAnsi" w:cstheme="minorHAnsi"/>
+          <w:bCs/>
+          <w:sz w:val="18"/>
+          <w:szCs w:val="18"/>
+        </w:rPr>
+      </w:pPr>
+      <w:r>
+        <w:rPr>
+          <w:rFonts w:asciiTheme="minorHAnsi" w:hAnsiTheme="minorHAnsi" w:cstheme="minorHAnsi"/>
+          <w:b/>
+          <w:sz w:val="18"/>
+          <w:szCs w:val="18"/>
+        </w:rPr>
+        <w:t>{label}:</w:t>
+      </w:r>
+      <w:r>
+        <w:rPr>
+          <w:rFonts w:asciiTheme="minorHAnsi" w:hAnsiTheme="minorHAnsi" w:cstheme="minorHAnsi"/>
+          <w:bCs/>
+          <w:sz w:val="18"/>
+          <w:szCs w:val="18"/>
+        </w:rPr>
+        <w:t xml:space="preserve"> </w:t>
+      </w:r>
+      <w:r>
+        <w:rPr>
+          <w:rFonts w:asciiTheme="minorHAnsi" w:hAnsiTheme="minorHAnsi" w:cstheme="minorHAnsi"/>
+          <w:bCs/>
+          <w:sz w:val="18"/>
+          <w:szCs w:val="18"/>
+        </w:rPr>
+        <w:t xml:space="preserve">{value}</w:t>
       </w:r>
     </w:p>
-    <w:p ns2:paraId="689E19FA" ns2:textId="72622552">
-      <w:pPr>
-        <w:pStyle w:val="BodyText2"/>
-        <w:rPr>
-          <w:rFonts w:asciiTheme="minorHAnsi" w:hAnsiTheme="minorHAnsi" w:cstheme="minorHAnsi"/>
-          <w:sz w:val="18"/>
-          <w:szCs w:val="18"/>
-        </w:rPr>
-      </w:pPr>
-      <w:r>
-        <w:rPr>
-          <w:rFonts w:asciiTheme="minorHAnsi" w:hAnsiTheme="minorHAnsi" w:cstheme="minorHAnsi"/>
-          <w:b/>
-          <w:sz w:val="18"/>
-          <w:szCs w:val="18"/>
-        </w:rPr>
-        <w:t>L</w:t>
-      </w:r>
-      <w:r>
-        <w:rPr>
-          <w:rFonts w:asciiTheme="minorHAnsi" w:hAnsiTheme="minorHAnsi" w:cstheme="minorHAnsi"/>
-          <w:b/>
-          <w:sz w:val="18"/>
-          <w:szCs w:val="18"/>
-        </w:rPr>
-        <w:t>anguages</w:t>
-      </w:r>
-      <w:r>
-        <w:rPr>
-          <w:rFonts w:asciiTheme="minorHAnsi" w:hAnsiTheme="minorHAnsi" w:cstheme="minorHAnsi"/>
-          <w:b/>
-          <w:sz w:val="18"/>
-          <w:szCs w:val="18"/>
-        </w:rPr>
-        <w:t xml:space="preserve">: </w:t>
-      </w:r>
-      <w:r>
-        <w:rPr>
-          <w:rFonts w:asciiTheme="minorHAnsi" w:hAnsiTheme="minorHAnsi" w:cstheme="minorHAnsi"/>
-          <w:sz w:val="18"/>
-          <w:szCs w:val="18"/>
-        </w:rPr>
-        <w:t>{skills.languages}</w:t>
-      </w:r>
-      <w:r>
-        <w:rPr>
-          <w:rFonts w:asciiTheme="minorHAnsi" w:hAnsiTheme="minorHAnsi" w:cstheme="minorHAnsi"/>
-          <w:sz w:val="18"/>
-          <w:szCs w:val="18"/>
-        </w:rPr>
-        <w:t/>
-      </w:r>
-      <w:r>
-        <w:rPr>
-          <w:rFonts w:asciiTheme="minorHAnsi" w:hAnsiTheme="minorHAnsi" w:cstheme="minorHAnsi"/>
-          <w:sz w:val="18"/>
-          <w:szCs w:val="18"/>
-        </w:rPr>
-        <w:t/>
-      </w:r>
-      <w:r>
-        <w:rPr>
-          <w:rFonts w:asciiTheme="minorHAnsi" w:hAnsiTheme="minorHAnsi" w:cstheme="minorHAnsi"/>
-          <w:sz w:val="18"/>
-          <w:szCs w:val="18"/>
-        </w:rPr>
-        <w:t/>
-      </w:r>
-      <w:r>
-        <w:rPr>
-          <w:rFonts w:asciiTheme="minorHAnsi" w:hAnsiTheme="minorHAnsi" w:cstheme="minorHAnsi"/>
-          <w:sz w:val="18"/>
-          <w:szCs w:val="18"/>
-        </w:rPr>
-        <w:t/>
-      </w:r>
-      <w:r>
-        <w:rPr>
-          <w:rFonts w:asciiTheme="minorHAnsi" w:hAnsiTheme="minorHAnsi" w:cstheme="minorHAnsi"/>
-          <w:sz w:val="18"/>
-          <w:szCs w:val="18"/>
-        </w:rPr>
-        <w:t/>
-      </w:r>
-      <w:r>
-        <w:rPr>
-          <w:rFonts w:asciiTheme="minorHAnsi" w:hAnsiTheme="minorHAnsi" w:cstheme="minorHAnsi"/>
-          <w:sz w:val="18"/>
-          <w:szCs w:val="18"/>
-        </w:rPr>
-        <w:t/>
+    <w:p>
+      <w:r>
+        <w:t>{/skills}</w:t>
       </w:r>
     </w:p>
     <w:p ns2:paraId="52CCAAD8" ns2:textId="0F2981DC">

</xml_diff>

<commit_message>
cv-patch: match the template to the user's real resume
Side by side with the user's own resume, the render differed in small but
visible ways: company qualifiers like "(via Accolite)" were bold instead of
italic, the company-line dates were not bold, contact items sat closer
together, and section spacing drifted by a few points. The company name is
split at render time into a bold name and an italic trailing parenthetical
(data model unchanged), company meta is bold, the contact separator matches
the original's six spaces, and paragraph spacing follows the original's
structure. Rendering the user's resume now lines up with the original to
within a fraction of a point.
</commit_message>
<xml_diff>
--- a/apps/cv-patch/convex/assets/resume-template.docx
+++ b/apps/cv-patch/convex/assets/resume-template.docx
@@ -217,7 +217,6 @@
     </w:p>
     <w:p ns2:paraId="43308B3D" ns2:textId="5A3BDF77">
       <w:pPr>
-        <w:spacing w:before="120"/>
         <w:tabs>
           <w:tab w:val="right" w:pos="10348"/>
         </w:tabs>
@@ -586,6 +585,16 @@
       </w:r>
     </w:p>
     <w:p>
+      <w:pPr>
+        <w:pStyle w:val="NoSpacing"/>
+        <w:rPr>
+          <w:rFonts w:asciiTheme="minorHAnsi" w:hAnsiTheme="minorHAnsi" w:cstheme="minorHAnsi"/>
+          <w:sz w:val="18"/>
+          <w:szCs w:val="18"/>
+        </w:rPr>
+      </w:pPr>
+    </w:p>
+    <w:p>
       <w:r>
         <w:t>{/education}</w:t>
       </w:r>
@@ -596,7 +605,7 @@
         <w:pBdr>
           <w:top w:val="single" w:sz="4" w:space="1" w:color="auto"/>
         </w:pBdr>
-        <w:spacing w:before="240" w:after="120"/>
+        <w:spacing w:before="0" w:after="120"/>
         <w:rPr>
           <w:rFonts w:asciiTheme="minorHAnsi" w:hAnsiTheme="minorHAnsi" w:cstheme="minorHAnsi"/>
           <w:b w:val="0"/>
@@ -621,7 +630,6 @@
     </w:p>
     <w:p ns2:paraId="02F068D1" ns2:textId="14EA54A9">
       <w:pPr>
-        <w:spacing w:before="120"/>
         <w:tabs>
           <w:tab w:val="right" w:pos="10348"/>
         </w:tabs>
@@ -641,7 +649,18 @@
           <w:sz w:val="18"/>
           <w:szCs w:val="18"/>
         </w:rPr>
-        <w:t xml:space="preserve">{company}</w:t>
+        <w:t xml:space="preserve">{companyName}</w:t>
+      </w:r>
+      <w:r>
+        <w:rPr>
+          <w:rFonts w:asciiTheme="minorHAnsi" w:hAnsiTheme="minorHAnsi" w:cstheme="minorHAnsi"/>
+          <w:bCs/>
+          <w:i/>
+          <w:iCs/>
+          <w:sz w:val="18"/>
+          <w:szCs w:val="18"/>
+        </w:rPr>
+        <w:t xml:space="preserve">{companySuffix}</w:t>
       </w:r>
       <w:proofErr w:type="spellStart"/>
       <w:r>
@@ -675,6 +694,7 @@
       <w:r>
         <w:rPr>
           <w:rFonts w:asciiTheme="minorHAnsi" w:hAnsiTheme="minorHAnsi" w:cstheme="minorHAnsi"/>
+          <w:b/>
           <w:bCs/>
           <w:sz w:val="18"/>
           <w:szCs w:val="18"/>
@@ -1053,6 +1073,17 @@
       </w:r>
     </w:p>
     <w:p>
+      <w:pPr>
+        <w:pStyle w:val="NoSpacing"/>
+        <w:jc w:val="both"/>
+        <w:rPr>
+          <w:rFonts w:asciiTheme="minorHAnsi" w:hAnsiTheme="minorHAnsi" w:cstheme="minorHAnsi"/>
+          <w:sz w:val="18"/>
+          <w:szCs w:val="18"/>
+        </w:rPr>
+      </w:pPr>
+    </w:p>
+    <w:p>
       <w:r>
         <w:t>{/experience}</w:t>
       </w:r>
@@ -1063,7 +1094,7 @@
         <w:pBdr>
           <w:top w:val="single" w:sz="4" w:space="1" w:color="auto"/>
         </w:pBdr>
-        <w:spacing w:before="240" w:after="120"/>
+        <w:spacing w:after="120"/>
         <w:rPr>
           <w:rFonts w:asciiTheme="minorHAnsi" w:hAnsiTheme="minorHAnsi" w:cstheme="minorHAnsi"/>
           <w:b/>
@@ -1090,7 +1121,6 @@
     </w:p>
     <w:p ns2:paraId="73FC873D" ns2:textId="38F5E544">
       <w:pPr>
-        <w:spacing w:before="120"/>
         <w:tabs>
           <w:tab w:val="right" w:pos="10348"/>
         </w:tabs>
@@ -1290,7 +1320,7 @@
         <w:pBdr>
           <w:top w:val="single" w:sz="4" w:space="1" w:color="auto"/>
         </w:pBdr>
-        <w:spacing w:before="240" w:after="120"/>
+        <w:spacing w:after="120"/>
         <w:rPr>
           <w:rFonts w:asciiTheme="minorHAnsi" w:hAnsiTheme="minorHAnsi" w:cstheme="minorHAnsi"/>
           <w:b/>
@@ -1355,6 +1385,16 @@
       <w:r>
         <w:t>{/skills}</w:t>
       </w:r>
+    </w:p>
+    <w:p>
+      <w:pPr>
+        <w:pStyle w:val="BodyText2"/>
+        <w:rPr>
+          <w:rFonts w:asciiTheme="minorHAnsi" w:hAnsiTheme="minorHAnsi" w:cstheme="minorHAnsi"/>
+          <w:sz w:val="18"/>
+          <w:szCs w:val="18"/>
+        </w:rPr>
+      </w:pPr>
     </w:p>
     <w:p ns2:paraId="52CCAAD8" ns2:textId="0F2981DC">
       <w:pPr>
@@ -1362,7 +1402,7 @@
         <w:pBdr>
           <w:top w:val="single" w:sz="4" w:space="1" w:color="auto"/>
         </w:pBdr>
-        <w:spacing w:before="240" w:after="120"/>
+        <w:spacing w:after="120"/>
         <w:jc w:val="left"/>
         <w:rPr>
           <w:rFonts w:asciiTheme="minorHAnsi" w:hAnsiTheme="minorHAnsi" w:cstheme="minorHAnsi"/>

</xml_diff>